<commit_message>
fix: synchronize all latest aesthetic and numbering updates for Runner
</commit_message>
<xml_diff>
--- a/M_Rizky_Pratama_CV.docx
+++ b/M_Rizky_Pratama_CV.docx
@@ -575,6 +575,62 @@
           <w:sz w:val="24"/>
         </w:rPr>
         <w:t>Field &amp; Event Experience</w:t>
+      </w:r>
+    </w:p>
+    <w:tbl>
+      <w:tblPr>
+        <w:tblW w:type="auto" w:w="0"/>
+        <w:tblLayout w:type="fixed"/>
+        <w:tblLook w:firstColumn="1" w:firstRow="1" w:lastColumn="0" w:lastRow="0" w:noHBand="0" w:noVBand="1" w:val="04A0"/>
+      </w:tblPr>
+      <w:tblGrid>
+        <w:gridCol w:w="8352"/>
+        <w:gridCol w:w="2160"/>
+      </w:tblGrid>
+      <w:tr>
+        <w:tc>
+          <w:tcPr>
+            <w:tcW w:type="dxa" w:w="5256"/>
+          </w:tcPr>
+          <w:p>
+            <w:pPr>
+              <w:spacing w:after="0"/>
+            </w:pPr>
+            <w:r>
+              <w:rPr>
+                <w:b/>
+              </w:rPr>
+              <w:t>GCP Automation: Let the Cloud Do It For You</w:t>
+            </w:r>
+            <w:r>
+              <w:t xml:space="preserve"> - PIC</w:t>
+            </w:r>
+          </w:p>
+        </w:tc>
+        <w:tc>
+          <w:tcPr>
+            <w:tcW w:type="dxa" w:w="5256"/>
+          </w:tcPr>
+          <w:p>
+            <w:pPr>
+              <w:spacing w:after="0"/>
+              <w:jc w:val="right"/>
+            </w:pPr>
+            <w:r>
+              <w:t>Mar 13, 2026</w:t>
+            </w:r>
+          </w:p>
+        </w:tc>
+      </w:tr>
+    </w:tbl>
+    <w:p>
+      <w:pPr>
+        <w:pStyle w:val="ListBullet"/>
+        <w:spacing w:after="0"/>
+        <w:ind w:left="360"/>
+      </w:pPr>
+      <w:r>
+        <w:t>Person-in-Charge of the GCP Automation event, coordinating speakers and flow.</w:t>
       </w:r>
     </w:p>
     <w:tbl>
@@ -1387,7 +1443,7 @@
               <w:t>Flutter Fusion Conference</w:t>
             </w:r>
             <w:r>
-              <w:t xml:space="preserve"> - Volunteer</w:t>
+              <w:t xml:space="preserve"> - Equipment Staff</w:t>
             </w:r>
           </w:p>
         </w:tc>

</xml_diff>